<commit_message>
5 May (REDI draft 2 progress)
</commit_message>
<xml_diff>
--- a/Output/REDI Report Draft 2.docx
+++ b/Output/REDI Report Draft 2.docx
@@ -1144,7 +1144,42 @@
           <w:rFonts w:ascii="Times New Roman" w:eastAsia="Times New Roman" w:hAnsi="Times New Roman" w:cs="Times New Roman"/>
           <w:color w:val="000000" w:themeColor="text1"/>
         </w:rPr>
-        <w:t xml:space="preserve">When we compare where migrant farm workers live to where migrant health centers are located, the connection is weak. Statistically, the correlation is just 0.143 on a scale </w:t>
+        <w:t>When we compare where migrant farm workers live to where migrant health centers are located, the connection is weak. Statistically, the correlation is just 0.</w:t>
+      </w:r>
+      <w:r>
+        <w:rPr>
+          <w:rFonts w:ascii="Times New Roman" w:eastAsia="Times New Roman" w:hAnsi="Times New Roman" w:cs="Times New Roman"/>
+          <w:color w:val="000000" w:themeColor="text1"/>
+        </w:rPr>
+        <w:t>289</w:t>
+      </w:r>
+      <w:r>
+        <w:rPr>
+          <w:rFonts w:ascii="Times New Roman" w:eastAsia="Times New Roman" w:hAnsi="Times New Roman" w:cs="Times New Roman"/>
+          <w:color w:val="000000" w:themeColor="text1"/>
+        </w:rPr>
+        <w:t xml:space="preserve">, and 0.274 when </w:t>
+      </w:r>
+      <w:r>
+        <w:rPr>
+          <w:rFonts w:ascii="Times New Roman" w:eastAsia="Times New Roman" w:hAnsi="Times New Roman" w:cs="Times New Roman"/>
+          <w:color w:val="000000" w:themeColor="text1"/>
+        </w:rPr>
+        <w:t xml:space="preserve">adjusted for </w:t>
+      </w:r>
+      <w:r>
+        <w:rPr>
+          <w:rFonts w:ascii="Times New Roman" w:eastAsia="Times New Roman" w:hAnsi="Times New Roman" w:cs="Times New Roman"/>
+          <w:color w:val="000000" w:themeColor="text1"/>
+        </w:rPr>
+        <w:t>square miles,</w:t>
+      </w:r>
+      <w:r>
+        <w:rPr>
+          <w:rFonts w:ascii="Times New Roman" w:eastAsia="Times New Roman" w:hAnsi="Times New Roman" w:cs="Times New Roman"/>
+          <w:color w:val="000000" w:themeColor="text1"/>
+        </w:rPr>
+        <w:t xml:space="preserve"> on a scale </w:t>
       </w:r>
       <w:commentRangeEnd w:id="0"/>
       <w:r>
@@ -1165,21 +1200,7 @@
           <w:rFonts w:ascii="Times New Roman" w:eastAsia="Times New Roman" w:hAnsi="Times New Roman" w:cs="Times New Roman"/>
           <w:color w:val="000000" w:themeColor="text1"/>
         </w:rPr>
-        <w:t xml:space="preserve">from -1 to 1—close to zero. </w:t>
-      </w:r>
-      <w:r>
-        <w:rPr>
-          <w:rFonts w:ascii="Times New Roman" w:eastAsia="Times New Roman" w:hAnsi="Times New Roman" w:cs="Times New Roman"/>
-          <w:color w:val="000000" w:themeColor="text1"/>
-        </w:rPr>
-        <w:t>[</w:t>
-      </w:r>
-      <w:r>
-        <w:rPr>
-          <w:rFonts w:ascii="Times New Roman" w:eastAsia="Times New Roman" w:hAnsi="Times New Roman" w:cs="Times New Roman"/>
-          <w:color w:val="000000" w:themeColor="text1"/>
-        </w:rPr>
-        <w:t xml:space="preserve">On an </w:t>
+        <w:t xml:space="preserve">from -1 to 1. On an </w:t>
       </w:r>
       <w:commentRangeStart w:id="2"/>
       <w:r>
@@ -1201,21 +1222,7 @@
           <w:rFonts w:ascii="Times New Roman" w:eastAsia="Times New Roman" w:hAnsi="Times New Roman" w:cs="Times New Roman"/>
           <w:color w:val="000000" w:themeColor="text1"/>
         </w:rPr>
-        <w:t xml:space="preserve">scale by state, </w:t>
-      </w:r>
-      <w:r>
-        <w:rPr>
-          <w:rFonts w:ascii="Times New Roman" w:eastAsia="Times New Roman" w:hAnsi="Times New Roman" w:cs="Times New Roman"/>
-          <w:color w:val="FF0000"/>
-        </w:rPr>
-        <w:t xml:space="preserve">On the state level,] </w:t>
-      </w:r>
-      <w:r>
-        <w:rPr>
-          <w:rFonts w:ascii="Times New Roman" w:eastAsia="Times New Roman" w:hAnsi="Times New Roman" w:cs="Times New Roman"/>
-          <w:color w:val="000000" w:themeColor="text1"/>
-        </w:rPr>
-        <w:t>we see the following correlations (Wyoming and South Dakota are empty because they have zero MHCs), which are better, but only slightly.</w:t>
+        <w:t>scale by state, we see the following correlations (Wyoming and South Dakota are empty because they have zero MHCs), which are better, but only slightly.</w:t>
       </w:r>
     </w:p>
     <w:p>
@@ -1227,10 +1234,10 @@
           <w:noProof/>
         </w:rPr>
         <w:drawing>
-          <wp:inline distT="0" distB="0" distL="0" distR="0" wp14:anchorId="62FA5CB5" wp14:editId="2D2C92CE">
-            <wp:extent cx="3854518" cy="1495425"/>
-            <wp:effectExtent l="19050" t="19050" r="12700" b="9525"/>
-            <wp:docPr id="884345511" name="Picture 884345511"/>
+          <wp:inline distT="0" distB="0" distL="0" distR="0" wp14:anchorId="3CE18DB5" wp14:editId="32D25C2A">
+            <wp:extent cx="3711262" cy="1463167"/>
+            <wp:effectExtent l="0" t="0" r="3810" b="3810"/>
+            <wp:docPr id="1972342124" name="Picture 2" descr="A table with numbers and letters&#10;&#10;AI-generated content may be incorrect."/>
             <wp:cNvGraphicFramePr>
               <a:graphicFrameLocks xmlns:a="http://schemas.openxmlformats.org/drawingml/2006/main" noChangeAspect="1"/>
             </wp:cNvGraphicFramePr>
@@ -1238,7 +1245,7 @@
               <a:graphicData uri="http://schemas.openxmlformats.org/drawingml/2006/picture">
                 <pic:pic xmlns:pic="http://schemas.openxmlformats.org/drawingml/2006/picture">
                   <pic:nvPicPr>
-                    <pic:cNvPr id="884345511" name="Picture 884345511"/>
+                    <pic:cNvPr id="1972342124" name="Picture 2" descr="A table with numbers and letters&#10;&#10;AI-generated content may be incorrect."/>
                     <pic:cNvPicPr/>
                   </pic:nvPicPr>
                   <pic:blipFill>
@@ -1256,17 +1263,11 @@
                   <pic:spPr>
                     <a:xfrm>
                       <a:off x="0" y="0"/>
-                      <a:ext cx="3854518" cy="1495425"/>
+                      <a:ext cx="3711262" cy="1463167"/>
                     </a:xfrm>
                     <a:prstGeom prst="rect">
                       <a:avLst/>
                     </a:prstGeom>
-                    <a:ln w="9525">
-                      <a:solidFill>
-                        <a:schemeClr val="tx1"/>
-                      </a:solidFill>
-                      <a:prstDash val="solid"/>
-                    </a:ln>
                   </pic:spPr>
                 </pic:pic>
               </a:graphicData>
@@ -1334,6 +1335,9 @@
     <w:p>
       <w:pPr>
         <w:ind w:firstLine="720"/>
+        <w:rPr>
+          <w:color w:val="FF0000"/>
+        </w:rPr>
       </w:pPr>
       <w:r>
         <w:rPr>
@@ -1424,6 +1428,27 @@
           <w:color w:val="000000" w:themeColor="text1"/>
         </w:rPr>
         <w:t>with no MHCs at all.</w:t>
+      </w:r>
+      <w:r>
+        <w:rPr>
+          <w:rFonts w:ascii="Times New Roman" w:eastAsia="Times New Roman" w:hAnsi="Times New Roman" w:cs="Times New Roman"/>
+          <w:color w:val="000000" w:themeColor="text1"/>
+        </w:rPr>
+        <w:t xml:space="preserve"> </w:t>
+      </w:r>
+      <w:r>
+        <w:rPr>
+          <w:rFonts w:ascii="Times New Roman" w:eastAsia="Times New Roman" w:hAnsi="Times New Roman" w:cs="Times New Roman"/>
+          <w:color w:val="FF0000"/>
+        </w:rPr>
+        <w:t>Mesa County</w:t>
+      </w:r>
+      <w:r>
+        <w:rPr>
+          <w:rFonts w:ascii="Times New Roman" w:eastAsia="Times New Roman" w:hAnsi="Times New Roman" w:cs="Times New Roman"/>
+          <w:color w:val="FF0000"/>
+        </w:rPr>
+        <w:t xml:space="preserve"> has the second-most H-2A workers with no MHCs at all.</w:t>
       </w:r>
     </w:p>
     <w:p>
@@ -1488,15 +1513,13 @@
         </w:rPr>
         <w:t xml:space="preserve">Many migrant workers live and work in areas with the looming risk of wildfires, heat waves, and droughts. Yet, those same areas often have no MHCs at all. In other words, the people most exposed to climate threats have the least access to care. There are more workers where exposure is higher and </w:t>
       </w:r>
-      <w:proofErr w:type="gramStart"/>
-      <w:r>
-        <w:rPr>
-          <w:rFonts w:ascii="Times New Roman" w:eastAsia="Times New Roman" w:hAnsi="Times New Roman" w:cs="Times New Roman"/>
-          <w:color w:val="000000" w:themeColor="text1"/>
-        </w:rPr>
-        <w:t>limited</w:t>
-      </w:r>
-      <w:proofErr w:type="gramEnd"/>
+      <w:r>
+        <w:rPr>
+          <w:rFonts w:ascii="Times New Roman" w:eastAsia="Times New Roman" w:hAnsi="Times New Roman" w:cs="Times New Roman"/>
+          <w:color w:val="000000" w:themeColor="text1"/>
+        </w:rPr>
+        <w:t>there are limited</w:t>
+      </w:r>
       <w:r>
         <w:rPr>
           <w:rFonts w:ascii="Times New Roman" w:eastAsia="Times New Roman" w:hAnsi="Times New Roman" w:cs="Times New Roman"/>
@@ -1555,7 +1578,6 @@
           <w:rFonts w:ascii="Times New Roman" w:eastAsia="Times New Roman" w:hAnsi="Times New Roman" w:cs="Times New Roman"/>
           <w:color w:val="000000" w:themeColor="text1"/>
         </w:rPr>
-        <w:lastRenderedPageBreak/>
         <w:t xml:space="preserve">Table 2: Correlations between H-2A workers, MHCs with environmental </w:t>
       </w:r>
       <w:commentRangeStart w:id="7"/>

</xml_diff>